<commit_message>
Add R to programming languages
</commit_message>
<xml_diff>
--- a/Alex Paquette Resume.docx
+++ b/Alex Paquette Resume.docx
@@ -326,26 +326,7 @@
           <w:sz w:val="24"/>
           <w:szCs w:val="24"/>
         </w:rPr>
-        <w:t xml:space="preserve">Applications </w:t>
-      </w:r>
-      <w:r>
-        <w:rPr>
-          <w:rFonts w:cs="Arial" w:ascii="Arial" w:hAnsi="Arial"/>
-          <w:b/>
-          <w:bCs/>
-          <w:sz w:val="24"/>
-          <w:szCs w:val="24"/>
-        </w:rPr>
-        <w:t>&amp; Tools</w:t>
-      </w:r>
-      <w:r>
-        <w:rPr>
-          <w:rFonts w:cs="Arial" w:ascii="Arial" w:hAnsi="Arial"/>
-          <w:b/>
-          <w:bCs/>
-          <w:sz w:val="24"/>
-          <w:szCs w:val="24"/>
-        </w:rPr>
+        <w:t>Applications &amp; Tools</w:t>
         <w:tab/>
         <w:tab/>
       </w:r>
@@ -472,35 +453,17 @@
           <w:sz w:val="24"/>
           <w:szCs w:val="24"/>
         </w:rPr>
-        <w:t xml:space="preserve">Frameworks </w:t>
-      </w:r>
-      <w:r>
-        <w:rPr>
-          <w:rFonts w:cs="Arial" w:ascii="Arial" w:hAnsi="Arial"/>
-          <w:b/>
-          <w:bCs/>
-          <w:sz w:val="24"/>
-          <w:szCs w:val="24"/>
-        </w:rPr>
-        <w:t>&amp; Libraries</w:t>
-      </w:r>
-      <w:r>
-        <w:rPr>
-          <w:rFonts w:cs="Arial" w:ascii="Arial" w:hAnsi="Arial"/>
-          <w:sz w:val="24"/>
-          <w:szCs w:val="24"/>
-        </w:rPr>
-        <w:tab/>
-        <w:tab/>
-        <w:t>.</w:t>
-      </w:r>
-      <w:r>
-        <w:rPr>
-          <w:rFonts w:cs="Arial" w:ascii="Arial" w:hAnsi="Arial"/>
-          <w:sz w:val="24"/>
-          <w:szCs w:val="24"/>
-        </w:rPr>
-        <w:t>NET, NUnit, Pytest, Numpy</w:t>
+        <w:t>Frameworks &amp; Libraries</w:t>
+      </w:r>
+      <w:r>
+        <w:rPr>
+          <w:rFonts w:cs="Arial" w:ascii="Arial" w:hAnsi="Arial"/>
+          <w:sz w:val="24"/>
+          <w:szCs w:val="24"/>
+        </w:rPr>
+        <w:tab/>
+        <w:tab/>
+        <w:t>.NET, NUnit, Pytest, Numpy</w:t>
       </w:r>
     </w:p>
     <w:p>
@@ -527,17 +490,7 @@
           <w:sz w:val="24"/>
           <w:szCs w:val="24"/>
         </w:rPr>
-        <w:t xml:space="preserve">Programming </w:t>
-      </w:r>
-      <w:r>
-        <w:rPr>
-          <w:rFonts w:cs="Arial" w:ascii="Arial" w:hAnsi="Arial"/>
-          <w:b/>
-          <w:bCs/>
-          <w:sz w:val="24"/>
-          <w:szCs w:val="24"/>
-        </w:rPr>
-        <w:t>Languages</w:t>
+        <w:t>Programming Languages</w:t>
       </w:r>
       <w:r>
         <w:rPr>
@@ -547,14 +500,15 @@
         </w:rPr>
         <w:t xml:space="preserve"> </w:t>
         <w:tab/>
-      </w:r>
-      <w:r>
-        <w:rPr>
-          <w:rFonts w:cs="Arial" w:ascii="Arial" w:hAnsi="Arial"/>
-          <w:sz w:val="24"/>
-          <w:szCs w:val="24"/>
-        </w:rPr>
-        <w:t>Bash, C#, JavaScript, Python, Nix, SQL</w:t>
+        <w:t xml:space="preserve">Bash, C#, JavaScript, Python, Nix, SQL, </w:t>
+      </w:r>
+      <w:r>
+        <w:rPr>
+          <w:rFonts w:cs="Arial" w:ascii="Arial" w:hAnsi="Arial"/>
+          <w:sz w:val="24"/>
+          <w:szCs w:val="24"/>
+        </w:rPr>
+        <w:t>R</w:t>
       </w:r>
     </w:p>
     <w:p>
@@ -729,7 +683,12 @@
         </w:rPr>
       </w:pPr>
       <w:r>
-        <w:rPr/>
+        <w:rPr>
+          <w:rFonts w:cs="Arial" w:ascii="Arial" w:hAnsi="Arial"/>
+          <w:sz w:val="24"/>
+          <w:szCs w:val="24"/>
+          <w:lang w:val="en-US"/>
+        </w:rPr>
       </w:r>
     </w:p>
     <w:p>
@@ -1083,7 +1042,14 @@
         </w:rPr>
       </w:pPr>
       <w:r>
-        <w:rPr/>
+        <w:rPr>
+          <w:rFonts w:cs="Arial" w:ascii="Arial" w:hAnsi="Arial"/>
+          <w:b w:val="false"/>
+          <w:bCs w:val="false"/>
+          <w:sz w:val="24"/>
+          <w:szCs w:val="24"/>
+          <w:lang w:val="en-US"/>
+        </w:rPr>
       </w:r>
     </w:p>
     <w:p>
@@ -1594,15 +1560,15 @@
           <wp:effectExtent l="0" t="0" r="0" b="0"/>
           <wp:wrapThrough wrapText="bothSides">
             <wp:wrapPolygon edited="0">
-              <wp:start x="6601" y="1318"/>
+              <wp:start x="6599" y="1318"/>
               <wp:lineTo x="-10" y="6619"/>
               <wp:lineTo x="-10" y="11919"/>
               <wp:lineTo x="2637" y="19864"/>
-              <wp:lineTo x="17201" y="19864"/>
+              <wp:lineTo x="17200" y="19864"/>
               <wp:lineTo x="19868" y="11919"/>
               <wp:lineTo x="19868" y="6619"/>
               <wp:lineTo x="13243" y="1318"/>
-              <wp:lineTo x="6601" y="1318"/>
+              <wp:lineTo x="6599" y="1318"/>
             </wp:wrapPolygon>
           </wp:wrapThrough>
           <wp:docPr id="1" name="Picture 1688827600" descr="A logo with yellow and grey letters&#10;&#10;AI-generated content may be incorrect." title=""/>
@@ -1666,15 +1632,15 @@
           <wp:effectExtent l="0" t="0" r="0" b="0"/>
           <wp:wrapThrough wrapText="bothSides">
             <wp:wrapPolygon edited="0">
-              <wp:start x="6601" y="1318"/>
+              <wp:start x="6599" y="1318"/>
               <wp:lineTo x="-10" y="6619"/>
               <wp:lineTo x="-10" y="11919"/>
               <wp:lineTo x="2637" y="19864"/>
-              <wp:lineTo x="17201" y="19864"/>
+              <wp:lineTo x="17200" y="19864"/>
               <wp:lineTo x="19868" y="11919"/>
               <wp:lineTo x="19868" y="6619"/>
               <wp:lineTo x="13243" y="1318"/>
-              <wp:lineTo x="6601" y="1318"/>
+              <wp:lineTo x="6599" y="1318"/>
             </wp:wrapPolygon>
           </wp:wrapThrough>
           <wp:docPr id="2" name="Image2" descr="A logo with yellow and grey letters&#10;&#10;AI-generated content may be incorrect." title=""/>
@@ -3392,8 +3358,8 @@
     <w:rsid w:val="00b06466"/>
     <w:rPr/>
   </w:style>
-  <w:style w:type="character" w:styleId="Bulletsuser">
-    <w:name w:val="Bullets (user)"/>
+  <w:style w:type="character" w:styleId="Bullets">
+    <w:name w:val="Bullets"/>
     <w:qFormat/>
     <w:rPr>
       <w:rFonts w:ascii="OpenSymbol" w:hAnsi="OpenSymbol" w:eastAsia="OpenSymbol" w:cs="OpenSymbol"/>

</xml_diff>